<commit_message>
Restructure section 05: merge ack/mention into teammate decision
- Replace 5.3 (Locale) with "Behave like a teammate, not a tool":
  combines mention-vs-command input + one-reply-rewritten-in-place output
- Remove 5.5 (Fail-fast config) — drifts from product design narrative
- 5.2 now defers to 5.3 for the ack-states visual (no duplicate image)
</commit_message>
<xml_diff>
--- a/docs/case-study.docx
+++ b/docs/case-study.docx
@@ -965,11 +965,42 @@
     </w:p>
     <w:p/>
     <w:p>
-      <w:r/>
-    </w:p>
-    <w:p>
-      <w:r>
-        <w:t>[image: assets/architecture.svg]</w:t>
+      <w:pPr>
+        <w:jc w:val="center"/>
+      </w:pPr>
+      <w:r>
+        <w:drawing>
+          <wp:inline xmlns:a="http://schemas.openxmlformats.org/drawingml/2006/main" xmlns:pic="http://schemas.openxmlformats.org/drawingml/2006/picture">
+            <wp:extent cx="5943600" cy="4074338"/>
+            <wp:docPr id="1" name="Picture 1"/>
+            <wp:cNvGraphicFramePr>
+              <a:graphicFrameLocks noChangeAspect="1"/>
+            </wp:cNvGraphicFramePr>
+            <a:graphic>
+              <a:graphicData uri="http://schemas.openxmlformats.org/drawingml/2006/picture">
+                <pic:pic>
+                  <pic:nvPicPr>
+                    <pic:cNvPr id="0" name="architecture.jpg"/>
+                    <pic:cNvPicPr/>
+                  </pic:nvPicPr>
+                  <pic:blipFill>
+                    <a:blip r:embed="rId9"/>
+                    <a:stretch>
+                      <a:fillRect/>
+                    </a:stretch>
+                  </pic:blipFill>
+                  <pic:spPr>
+                    <a:xfrm>
+                      <a:off x="0" y="0"/>
+                      <a:ext cx="5943600" cy="4074338"/>
+                    </a:xfrm>
+                    <a:prstGeom prst="rect"/>
+                  </pic:spPr>
+                </pic:pic>
+              </a:graphicData>
+            </a:graphic>
+          </wp:inline>
+        </w:drawing>
       </w:r>
     </w:p>
     <w:p>
@@ -1143,7 +1174,128 @@
         <w:t>中 —</w:t>
       </w:r>
       <w:r>
-        <w:t xml:space="preserve"> AI 调用耗时 8–20 秒。沉默在用户眼里就是"坏了"。FigWatch 在 400ms 内先回"Working on it…"，随后更新队列位置（"你排在第 3 位"），最后用审查结果覆盖占位回复。感知延迟骤降。</w:t>
+        <w:t xml:space="preserve"> AI 调用耗时 8–20 秒。沉默在用户眼里就是"坏了"。FigWatch 在 400ms 内先回"Working on it…"，随后更新队列位置（"你排在第 3 位"），最后用审查结果覆盖占位回复。感知延迟骤降（见 §5.3 的图）。</w:t>
+      </w:r>
+    </w:p>
+    <w:p/>
+    <w:p>
+      <w:pPr>
+        <w:pStyle w:val="Heading2"/>
+      </w:pPr>
+      <w:r>
+        <w:t>5.3 Behave like a teammate, not a tool / 像同事，而非机器人</w:t>
+      </w:r>
+    </w:p>
+    <w:p/>
+    <w:p>
+      <w:r>
+        <w:rPr>
+          <w:b/>
+        </w:rPr>
+        <w:t>EN —</w:t>
+      </w:r>
+      <w:r>
+        <w:t xml:space="preserve"> Every interaction follows the social rules of a human reviewer, not a bot's:</w:t>
+      </w:r>
+    </w:p>
+    <w:p/>
+    <w:p>
+      <w:pPr>
+        <w:pStyle w:val="ListBullet"/>
+      </w:pPr>
+      <w:r>
+        <w:rPr>
+          <w:b/>
+        </w:rPr>
+        <w:t>Input is a mention, not a command.</w:t>
+      </w:r>
+      <w:r>
+        <w:t xml:space="preserve"> </w:t>
+      </w:r>
+      <w:r>
+        <w:rPr>
+          <w:rFonts w:ascii="Consolas" w:hAnsi="Consolas"/>
+        </w:rPr>
+        <w:t>@ux</w:t>
+      </w:r>
+      <w:r>
+        <w:t xml:space="preserve"> tags FigWatch the same way you'd tag a colleague — same autocomplete, same visual treatment, no slash menu to learn. Designers don't onboard to a new UI; they just @ someone new.</w:t>
+      </w:r>
+    </w:p>
+    <w:p>
+      <w:pPr>
+        <w:pStyle w:val="ListBullet"/>
+      </w:pPr>
+      <w:r>
+        <w:rPr>
+          <w:b/>
+        </w:rPr>
+        <w:t>Output is one reply, rewritten in place.</w:t>
+      </w:r>
+      <w:r>
+        <w:t xml:space="preserve"> The ack, the queue update, and the final audit all overwrite the same comment. Never a second bubble, never a notification storm — exactly how a thoughtful reviewer edits their own message as they think.</w:t>
+      </w:r>
+    </w:p>
+    <w:p/>
+    <w:p>
+      <w:r>
+        <w:t>The cumulative effect: FigWatch reads like a coworker who happens to be fast, not an AI bolted onto the side of Figma.</w:t>
+      </w:r>
+    </w:p>
+    <w:p/>
+    <w:p>
+      <w:r>
+        <w:rPr>
+          <w:b/>
+        </w:rPr>
+        <w:t>中 —</w:t>
+      </w:r>
+      <w:r>
+        <w:t xml:space="preserve"> 每一次交互都遵守真人审查者的社交规则，而非机器人规则：</w:t>
+      </w:r>
+    </w:p>
+    <w:p/>
+    <w:p>
+      <w:pPr>
+        <w:pStyle w:val="ListBullet"/>
+      </w:pPr>
+      <w:r>
+        <w:rPr>
+          <w:b/>
+        </w:rPr>
+        <w:t>输入是提及，而不是命令。</w:t>
+      </w:r>
+      <w:r>
+        <w:t xml:space="preserve"> </w:t>
+      </w:r>
+      <w:r>
+        <w:rPr>
+          <w:rFonts w:ascii="Consolas" w:hAnsi="Consolas"/>
+        </w:rPr>
+        <w:t>@ux</w:t>
+      </w:r>
+      <w:r>
+        <w:t xml:space="preserve"> 就像 @ 一位同事，用的是 Figma 原生的 mention 自动补全，没有 slash 菜单、没有新语法要学。设计师不是在适应一个新工具，而是多 @ 了一个人。</w:t>
+      </w:r>
+    </w:p>
+    <w:p>
+      <w:pPr>
+        <w:pStyle w:val="ListBullet"/>
+      </w:pPr>
+      <w:r>
+        <w:rPr>
+          <w:b/>
+        </w:rPr>
+        <w:t>输出是一条回复，原地改写。</w:t>
+      </w:r>
+      <w:r>
+        <w:t xml:space="preserve"> 占位应答、队列更新、最终审查——全部覆盖同一条评论。永远不会多出第二个气泡，也不会刷屏通知——就像一个认真的审查者会边想边编辑自己的留言一样。</w:t>
+      </w:r>
+    </w:p>
+    <w:p/>
+    <w:p>
+      <w:r>
+        <w:t>叠加起来的结果：FigWatch 读起来像一个恰好很快的同事，而不是 Figma 边上硬塞进来的 AI。</w:t>
       </w:r>
     </w:p>
     <w:p/>
@@ -1152,10 +1304,46 @@
         <w:jc w:val="center"/>
       </w:pPr>
       <w:r>
+        <w:drawing>
+          <wp:inline xmlns:a="http://schemas.openxmlformats.org/drawingml/2006/main" xmlns:pic="http://schemas.openxmlformats.org/drawingml/2006/picture">
+            <wp:extent cx="5943600" cy="2772689"/>
+            <wp:docPr id="2" name="Picture 2"/>
+            <wp:cNvGraphicFramePr>
+              <a:graphicFrameLocks noChangeAspect="1"/>
+            </wp:cNvGraphicFramePr>
+            <a:graphic>
+              <a:graphicData uri="http://schemas.openxmlformats.org/drawingml/2006/picture">
+                <pic:pic>
+                  <pic:nvPicPr>
+                    <pic:cNvPr id="0" name="ack-states.jpg"/>
+                    <pic:cNvPicPr/>
+                  </pic:nvPicPr>
+                  <pic:blipFill>
+                    <a:blip r:embed="rId10"/>
+                    <a:stretch>
+                      <a:fillRect/>
+                    </a:stretch>
+                  </pic:blipFill>
+                  <pic:spPr>
+                    <a:xfrm>
+                      <a:off x="0" y="0"/>
+                      <a:ext cx="5943600" cy="2772689"/>
+                    </a:xfrm>
+                    <a:prstGeom prst="rect"/>
+                  </pic:spPr>
+                </pic:pic>
+              </a:graphicData>
+            </a:graphic>
+          </wp:inline>
+        </w:drawing>
+      </w:r>
+    </w:p>
+    <w:p>
+      <w:r>
         <w:rPr>
           <w:i/>
         </w:rPr>
-        <w:t>[placeholder: Acknowledgement states — ack → queue → final]</w:t>
+        <w:t>Same comment reply — ack → queue → final audit, all rewritten in place.</w:t>
       </w:r>
     </w:p>
     <w:p>
@@ -1163,7 +1351,7 @@
         <w:rPr>
           <w:i/>
         </w:rPr>
-        <w:t>Placeholder: 回复三态：占位 → 排队 → 最终结果</w:t>
+        <w:t>同一条回复——占位、排队、最终审查，全部原地改写。</w:t>
       </w:r>
     </w:p>
     <w:p/>
@@ -1172,7 +1360,7 @@
         <w:pStyle w:val="Heading2"/>
       </w:pPr>
       <w:r>
-        <w:t>5.3 Locale is a first-class citizen / 本地化不是后加的</w:t>
+        <w:t>5.4 Context-aware triggers / 评论即上下文</w:t>
       </w:r>
     </w:p>
     <w:p/>
@@ -1184,7 +1372,34 @@
         <w:t>EN —</w:t>
       </w:r>
       <w:r>
-        <w:t xml:space="preserve"> A UK copy audit scoring German formality is wrong by design. Locale (UK / DE / FR / NL / Benelux) is a required setting, surfaced in onboarding and visible in the menu bar. The tone audit loads regional punctuation, currency, and honorific rules before the first call.</w:t>
+        <w:t xml:space="preserve"> A trigger alone is a blunt instrument. Designers can append free-form context to the comment — "</w:t>
+      </w:r>
+      <w:r>
+        <w:rPr>
+          <w:rFonts w:ascii="Consolas" w:hAnsi="Consolas"/>
+        </w:rPr>
+        <w:t>@ux</w:t>
+      </w:r>
+      <w:r>
+        <w:t xml:space="preserve"> focus on the empty state", "</w:t>
+      </w:r>
+      <w:r>
+        <w:rPr>
+          <w:rFonts w:ascii="Consolas" w:hAnsi="Consolas"/>
+        </w:rPr>
+        <w:t>@tone</w:t>
+      </w:r>
+      <w:r>
+        <w:t xml:space="preserve"> this is for existing premium users", "</w:t>
+      </w:r>
+      <w:r>
+        <w:rPr>
+          <w:rFonts w:ascii="Consolas" w:hAnsi="Consolas"/>
+        </w:rPr>
+        <w:t>@a11y</w:t>
+      </w:r>
+      <w:r>
+        <w:t xml:space="preserve"> ignore the placeholder copy, review the button only". FigWatch passes that context straight into the audit prompt, so the reply narrows its scope, adjusts its voice, or ignores irrelevant regions. Same trigger, different answer — shaped by whatever the designer types after it.</w:t>
       </w:r>
     </w:p>
     <w:p/>
@@ -1196,7 +1411,34 @@
         <w:t>中 —</w:t>
       </w:r>
       <w:r>
-        <w:t xml:space="preserve"> 一个英式文案审查用来评判德语的正式度，从设定上就错了。Locale（UK / DE / FR / NL / Benelux）是必填项，在引导流程和菜单栏里都显式存在。Tone 审查在第一次调用前就加载好区域的标点、币种与敬语规则。</w:t>
+        <w:t xml:space="preserve"> 只有触发词太粗暴。设计师可以在评论里追加自由文本作为上下文——"</w:t>
+      </w:r>
+      <w:r>
+        <w:rPr>
+          <w:rFonts w:ascii="Consolas" w:hAnsi="Consolas"/>
+        </w:rPr>
+        <w:t>@ux</w:t>
+      </w:r>
+      <w:r>
+        <w:t xml:space="preserve"> 重点看空状态"、"</w:t>
+      </w:r>
+      <w:r>
+        <w:rPr>
+          <w:rFonts w:ascii="Consolas" w:hAnsi="Consolas"/>
+        </w:rPr>
+        <w:t>@tone</w:t>
+      </w:r>
+      <w:r>
+        <w:t xml:space="preserve"> 这是给高端付费用户的"、"</w:t>
+      </w:r>
+      <w:r>
+        <w:rPr>
+          <w:rFonts w:ascii="Consolas" w:hAnsi="Consolas"/>
+        </w:rPr>
+        <w:t>@a11y</w:t>
+      </w:r>
+      <w:r>
+        <w:t xml:space="preserve"> 忽略占位文字，只审查按钮"。FigWatch 会把这段上下文直接注入审查 prompt，让回复收缩范围、调整语气、或跳过无关区域。同一个触发词，不同上下文，得到不同答案。</w:t>
       </w:r>
     </w:p>
     <w:p/>
@@ -1208,113 +1450,6 @@
         <w:rPr>
           <w:i/>
         </w:rPr>
-        <w:t>[placeholder: Locale picker in onboarding]</w:t>
-      </w:r>
-    </w:p>
-    <w:p>
-      <w:r>
-        <w:rPr>
-          <w:i/>
-        </w:rPr>
-        <w:t>Placeholder: 引导流程中的 Locale 选择器</w:t>
-      </w:r>
-    </w:p>
-    <w:p/>
-    <w:p>
-      <w:pPr>
-        <w:pStyle w:val="Heading2"/>
-      </w:pPr>
-      <w:r>
-        <w:t>5.4 Context-aware triggers / 评论即上下文</w:t>
-      </w:r>
-    </w:p>
-    <w:p/>
-    <w:p>
-      <w:r>
-        <w:rPr>
-          <w:b/>
-        </w:rPr>
-        <w:t>EN —</w:t>
-      </w:r>
-      <w:r>
-        <w:t xml:space="preserve"> A trigger alone is a blunt instrument. Designers can append free-form context to the comment — "</w:t>
-      </w:r>
-      <w:r>
-        <w:rPr>
-          <w:rFonts w:ascii="Consolas" w:hAnsi="Consolas"/>
-        </w:rPr>
-        <w:t>@ux</w:t>
-      </w:r>
-      <w:r>
-        <w:t xml:space="preserve"> focus on the empty state", "</w:t>
-      </w:r>
-      <w:r>
-        <w:rPr>
-          <w:rFonts w:ascii="Consolas" w:hAnsi="Consolas"/>
-        </w:rPr>
-        <w:t>@tone</w:t>
-      </w:r>
-      <w:r>
-        <w:t xml:space="preserve"> this is for existing premium users", "</w:t>
-      </w:r>
-      <w:r>
-        <w:rPr>
-          <w:rFonts w:ascii="Consolas" w:hAnsi="Consolas"/>
-        </w:rPr>
-        <w:t>@a11y</w:t>
-      </w:r>
-      <w:r>
-        <w:t xml:space="preserve"> ignore the placeholder copy, review the button only". FigWatch passes that context straight into the audit prompt, so the reply narrows its scope, adjusts its voice, or ignores irrelevant regions. Same trigger, different answer — shaped by whatever the designer types after it.</w:t>
-      </w:r>
-    </w:p>
-    <w:p/>
-    <w:p>
-      <w:r>
-        <w:rPr>
-          <w:b/>
-        </w:rPr>
-        <w:t>中 —</w:t>
-      </w:r>
-      <w:r>
-        <w:t xml:space="preserve"> 只有触发词太粗暴。设计师可以在评论里追加自由文本作为上下文——"</w:t>
-      </w:r>
-      <w:r>
-        <w:rPr>
-          <w:rFonts w:ascii="Consolas" w:hAnsi="Consolas"/>
-        </w:rPr>
-        <w:t>@ux</w:t>
-      </w:r>
-      <w:r>
-        <w:t xml:space="preserve"> 重点看空状态"、"</w:t>
-      </w:r>
-      <w:r>
-        <w:rPr>
-          <w:rFonts w:ascii="Consolas" w:hAnsi="Consolas"/>
-        </w:rPr>
-        <w:t>@tone</w:t>
-      </w:r>
-      <w:r>
-        <w:t xml:space="preserve"> 这是给高端付费用户的"、"</w:t>
-      </w:r>
-      <w:r>
-        <w:rPr>
-          <w:rFonts w:ascii="Consolas" w:hAnsi="Consolas"/>
-        </w:rPr>
-        <w:t>@a11y</w:t>
-      </w:r>
-      <w:r>
-        <w:t xml:space="preserve"> 忽略占位文字，只审查按钮"。FigWatch 会把这段上下文直接注入审查 prompt，让回复收缩范围、调整语气、或跳过无关区域。同一个触发词，不同上下文，得到不同答案。</w:t>
-      </w:r>
-    </w:p>
-    <w:p/>
-    <w:p>
-      <w:pPr>
-        <w:jc w:val="center"/>
-      </w:pPr>
-      <w:r>
-        <w:rPr>
-          <w:i/>
-        </w:rPr>
         <w:t>[placeholder: Context-aware trigger — same @ux, different scope]</w:t>
       </w:r>
     </w:p>
@@ -1324,59 +1459,6 @@
           <w:i/>
         </w:rPr>
         <w:t>Placeholder: 同一个 `@ux`，追加不同上下文得到不同审查结果</w:t>
-      </w:r>
-    </w:p>
-    <w:p/>
-    <w:p>
-      <w:pPr>
-        <w:pStyle w:val="Heading2"/>
-      </w:pPr>
-      <w:r>
-        <w:t>5.5 Fail-fast configuration / 配置即刻失败</w:t>
-      </w:r>
-    </w:p>
-    <w:p/>
-    <w:p>
-      <w:r>
-        <w:rPr>
-          <w:b/>
-        </w:rPr>
-        <w:t>EN —</w:t>
-      </w:r>
-      <w:r>
-        <w:t xml:space="preserve"> Invalid env var → the service refuses to start. Better a loud crash at boot than a silent failure under load. Documented as ADR-001; it shaped how the settings UI validates values live — if the server would reject it, the form rejects it.</w:t>
-      </w:r>
-    </w:p>
-    <w:p/>
-    <w:p>
-      <w:r>
-        <w:rPr>
-          <w:b/>
-        </w:rPr>
-        <w:t>中 —</w:t>
-      </w:r>
-      <w:r>
-        <w:t xml:space="preserve"> 环境变量不合法 → 服务拒绝启动。启动时大声崩溃，好过运行时静默出错。这条沉淀为 ADR-001，也约束了设置界面的交互：服务端会拒绝的值，表单就当场拒绝。</w:t>
-      </w:r>
-    </w:p>
-    <w:p/>
-    <w:p>
-      <w:pPr>
-        <w:jc w:val="center"/>
-      </w:pPr>
-      <w:r>
-        <w:rPr>
-          <w:i/>
-        </w:rPr>
-        <w:t>[placeholder: Settings form — inline validation mirroring server rules]</w:t>
-      </w:r>
-    </w:p>
-    <w:p>
-      <w:r>
-        <w:rPr>
-          <w:i/>
-        </w:rPr>
-        <w:t>Placeholder: 设置界面的即时校验</w:t>
       </w:r>
     </w:p>
     <w:p/>

</xml_diff>

<commit_message>
Align §5.4 image and §08 outcome with restructured section 05
- §5.4 uses real context-aware-trigger.svg instead of placeholder
- §08 replaces orphaned "5 locales" bullet with "zero new UI patterns"
  which ties back to the new §5.3 teammate decision
</commit_message>
<xml_diff>
--- a/docs/case-study.docx
+++ b/docs/case-study.docx
@@ -1447,10 +1447,46 @@
         <w:jc w:val="center"/>
       </w:pPr>
       <w:r>
+        <w:drawing>
+          <wp:inline xmlns:a="http://schemas.openxmlformats.org/drawingml/2006/main" xmlns:pic="http://schemas.openxmlformats.org/drawingml/2006/picture">
+            <wp:extent cx="5943600" cy="3057982"/>
+            <wp:docPr id="3" name="Picture 3"/>
+            <wp:cNvGraphicFramePr>
+              <a:graphicFrameLocks noChangeAspect="1"/>
+            </wp:cNvGraphicFramePr>
+            <a:graphic>
+              <a:graphicData uri="http://schemas.openxmlformats.org/drawingml/2006/picture">
+                <pic:pic>
+                  <pic:nvPicPr>
+                    <pic:cNvPr id="0" name="context-aware-trigger.jpg"/>
+                    <pic:cNvPicPr/>
+                  </pic:nvPicPr>
+                  <pic:blipFill>
+                    <a:blip r:embed="rId11"/>
+                    <a:stretch>
+                      <a:fillRect/>
+                    </a:stretch>
+                  </pic:blipFill>
+                  <pic:spPr>
+                    <a:xfrm>
+                      <a:off x="0" y="0"/>
+                      <a:ext cx="5943600" cy="3057982"/>
+                    </a:xfrm>
+                    <a:prstGeom prst="rect"/>
+                  </pic:spPr>
+                </pic:pic>
+              </a:graphicData>
+            </a:graphic>
+          </wp:inline>
+        </w:drawing>
+      </w:r>
+    </w:p>
+    <w:p>
+      <w:r>
         <w:rPr>
           <w:i/>
         </w:rPr>
-        <w:t>[placeholder: Context-aware trigger — same @ux, different scope]</w:t>
+        <w:t>Same `@ux` trigger, two different context strings → two different audits.</w:t>
       </w:r>
     </w:p>
     <w:p>
@@ -1458,7 +1494,7 @@
         <w:rPr>
           <w:i/>
         </w:rPr>
-        <w:t>Placeholder: 同一个 `@ux`，追加不同上下文得到不同审查结果</w:t>
+        <w:t>同一个 `@ux`，追加不同上下文 → 得到不同审查。</w:t>
       </w:r>
     </w:p>
     <w:p/>
@@ -2089,10 +2125,19 @@
         <w:rPr>
           <w:b/>
         </w:rPr>
-        <w:t>5 locales</w:t>
-      </w:r>
-      <w:r>
-        <w:t xml:space="preserve"> supported at launch with team-owned tone rules.</w:t>
+        <w:t>Zero new UI patterns</w:t>
+      </w:r>
+      <w:r>
+        <w:t xml:space="preserve"> introduced — </w:t>
+      </w:r>
+      <w:r>
+        <w:rPr>
+          <w:rFonts w:ascii="Consolas" w:hAnsi="Consolas"/>
+        </w:rPr>
+        <w:t>@</w:t>
+      </w:r>
+      <w:r>
+        <w:t xml:space="preserve"> mention is the only input surface designers have to learn.</w:t>
       </w:r>
     </w:p>
     <w:p/>
@@ -2215,16 +2260,22 @@
         <w:pStyle w:val="ListBullet"/>
       </w:pPr>
       <w:r>
-        <w:t xml:space="preserve">首发支持 </w:t>
-      </w:r>
-      <w:r>
         <w:rPr>
           <w:b/>
         </w:rPr>
-        <w:t>5 个地区</w:t>
-      </w:r>
-      <w:r>
-        <w:t>，Tone 规则完全由团队掌握。</w:t>
+        <w:t>没有引入任何新的交互范式</w:t>
+      </w:r>
+      <w:r>
+        <w:t>——</w:t>
+      </w:r>
+      <w:r>
+        <w:rPr>
+          <w:rFonts w:ascii="Consolas" w:hAnsi="Consolas"/>
+        </w:rPr>
+        <w:t>@</w:t>
+      </w:r>
+      <w:r>
+        <w:t xml:space="preserve"> 是设计师需要学习的唯一输入面。</w:t>
       </w:r>
     </w:p>
     <w:p/>

</xml_diff>